<commit_message>
feat: add dynamic header support and routing
- Implement route handlers for public assets.
- Update signage generator to include a dynamic top header image.
- Add ignore rules for Python bytecode files.
</commit_message>
<xml_diff>
--- a/output/HSE_Observation_Register.docx
+++ b/output/HSE_Observation_Register.docx
@@ -1168,7 +1168,7 @@
                 <w:b/>
                 <w:sz w:val="18"/>
               </w:rPr>
-              <w:t>Date: 17/09/2026</w:t>
+              <w:t>Date: 19/09/2026</w:t>
             </w:r>
           </w:p>
         </w:tc>
@@ -2357,7 +2357,7 @@
                 <w:b/>
                 <w:sz w:val="18"/>
               </w:rPr>
-              <w:t>Date: 17/09/2026</w:t>
+              <w:t>Date: 19/09/2026</w:t>
             </w:r>
           </w:p>
         </w:tc>
@@ -3546,7 +3546,7 @@
                 <w:b/>
                 <w:sz w:val="18"/>
               </w:rPr>
-              <w:t>Date: 17/09/2026</w:t>
+              <w:t>Date: 19/09/2026</w:t>
             </w:r>
           </w:p>
         </w:tc>
@@ -4735,7 +4735,7 @@
                 <w:b/>
                 <w:sz w:val="18"/>
               </w:rPr>
-              <w:t>Date: 17/09/2026</w:t>
+              <w:t>Date: 19/09/2026</w:t>
             </w:r>
           </w:p>
         </w:tc>
@@ -5924,7 +5924,7 @@
                 <w:b/>
                 <w:sz w:val="18"/>
               </w:rPr>
-              <w:t>Date: 17/09/2026</w:t>
+              <w:t>Date: 19/09/2026</w:t>
             </w:r>
           </w:p>
         </w:tc>
@@ -7113,7 +7113,7 @@
                 <w:b/>
                 <w:sz w:val="18"/>
               </w:rPr>
-              <w:t>Date: 17/09/2026</w:t>
+              <w:t>Date: 19/09/2026</w:t>
             </w:r>
           </w:p>
         </w:tc>
@@ -8302,7 +8302,7 @@
                 <w:b/>
                 <w:sz w:val="18"/>
               </w:rPr>
-              <w:t>Date: 17/09/2026</w:t>
+              <w:t>Date: 19/09/2026</w:t>
             </w:r>
           </w:p>
         </w:tc>
@@ -9491,7 +9491,7 @@
                 <w:b/>
                 <w:sz w:val="18"/>
               </w:rPr>
-              <w:t>Date: 17/09/2026</w:t>
+              <w:t>Date: 19/09/2026</w:t>
             </w:r>
           </w:p>
         </w:tc>

</xml_diff>

<commit_message>
refactor(services): improve date parsing robustness
Update `excel_reader.py` to better handle `pd.Timestamp` and additional null-like strings ('<NA>', 'NaT'). Removed unused imports and cleaned up `mapping.py` to improve maintainability.
</commit_message>
<xml_diff>
--- a/output/HSE_Observation_Register.docx
+++ b/output/HSE_Observation_Register.docx
@@ -119,7 +119,7 @@
                 <w:b/>
                 <w:sz w:val="19"/>
               </w:rPr>
-              <w:t>15/09/2026</w:t>
+              <w:t>01/09/2026</w:t>
             </w:r>
           </w:p>
         </w:tc>
@@ -427,7 +427,6 @@
                 <w:rFonts w:ascii="Arial" w:hAnsi="Arial"/>
                 <w:sz w:val="17"/>
               </w:rPr>
-              <w:t>1</w:t>
             </w:r>
           </w:p>
         </w:tc>
@@ -452,7 +451,7 @@
                 <w:rFonts w:ascii="Arial" w:hAnsi="Arial"/>
                 <w:sz w:val="17"/>
               </w:rPr>
-              <w:t>Substation 1</w:t>
+              <w:t>Area A</w:t>
             </w:r>
           </w:p>
         </w:tc>
@@ -477,7 +476,7 @@
                 <w:rFonts w:ascii="Arial" w:hAnsi="Arial"/>
                 <w:sz w:val="17"/>
               </w:rPr>
-              <w:t>Damaged electrical cable</w:t>
+              <w:t>Obs 1</w:t>
             </w:r>
           </w:p>
         </w:tc>
@@ -502,7 +501,7 @@
                 <w:rFonts w:ascii="Arial" w:hAnsi="Arial"/>
                 <w:sz w:val="17"/>
               </w:rPr>
-              <w:t>Replace cable immediately</w:t>
+              <w:t>Rec 1</w:t>
             </w:r>
           </w:p>
         </w:tc>
@@ -527,7 +526,7 @@
                 <w:rFonts w:ascii="Arial" w:hAnsi="Arial"/>
                 <w:sz w:val="17"/>
               </w:rPr>
-              <w:t>John Doe</w:t>
+              <w:t>Worker 1</w:t>
             </w:r>
           </w:p>
         </w:tc>
@@ -552,7 +551,7 @@
                 <w:rFonts w:ascii="Arial" w:hAnsi="Arial"/>
                 <w:sz w:val="17"/>
               </w:rPr>
-              <w:t>15/09/2026</w:t>
+              <w:t>01/09/2026</w:t>
             </w:r>
           </w:p>
         </w:tc>
@@ -633,7 +632,6 @@
                 <w:rFonts w:ascii="Arial" w:hAnsi="Arial"/>
                 <w:sz w:val="17"/>
               </w:rPr>
-              <w:t>2</w:t>
             </w:r>
           </w:p>
         </w:tc>
@@ -658,7 +656,7 @@
                 <w:rFonts w:ascii="Arial" w:hAnsi="Arial"/>
                 <w:sz w:val="17"/>
               </w:rPr>
-              <w:t>Storage Yard</w:t>
+              <w:t>Area B</w:t>
             </w:r>
           </w:p>
         </w:tc>
@@ -683,7 +681,7 @@
                 <w:rFonts w:ascii="Arial" w:hAnsi="Arial"/>
                 <w:sz w:val="17"/>
               </w:rPr>
-              <w:t>Missing fire extinguisher tag</w:t>
+              <w:t>Obs 2</w:t>
             </w:r>
           </w:p>
         </w:tc>
@@ -708,7 +706,7 @@
                 <w:rFonts w:ascii="Arial" w:hAnsi="Arial"/>
                 <w:sz w:val="17"/>
               </w:rPr>
-              <w:t>Inspect and tag extinguisher</w:t>
+              <w:t>Rec 2</w:t>
             </w:r>
           </w:p>
         </w:tc>
@@ -733,7 +731,7 @@
                 <w:rFonts w:ascii="Arial" w:hAnsi="Arial"/>
                 <w:sz w:val="17"/>
               </w:rPr>
-              <w:t>Jane Smith</w:t>
+              <w:t>Worker 2</w:t>
             </w:r>
           </w:p>
         </w:tc>
@@ -758,7 +756,7 @@
                 <w:rFonts w:ascii="Arial" w:hAnsi="Arial"/>
                 <w:sz w:val="17"/>
               </w:rPr>
-              <w:t>16/09/2026</w:t>
+              <w:t>02/09/2026</w:t>
             </w:r>
           </w:p>
         </w:tc>
@@ -839,7 +837,6 @@
                 <w:rFonts w:ascii="Arial" w:hAnsi="Arial"/>
                 <w:sz w:val="17"/>
               </w:rPr>
-              <w:t>3</w:t>
             </w:r>
           </w:p>
         </w:tc>
@@ -864,7 +861,7 @@
                 <w:rFonts w:ascii="Arial" w:hAnsi="Arial"/>
                 <w:sz w:val="17"/>
               </w:rPr>
-              <w:t>Pump House</w:t>
+              <w:t>Area C</w:t>
             </w:r>
           </w:p>
         </w:tc>
@@ -889,7 +886,7 @@
                 <w:rFonts w:ascii="Arial" w:hAnsi="Arial"/>
                 <w:sz w:val="17"/>
               </w:rPr>
-              <w:t>Uncovered trench</w:t>
+              <w:t>Obs 3</w:t>
             </w:r>
           </w:p>
         </w:tc>
@@ -914,7 +911,7 @@
                 <w:rFonts w:ascii="Arial" w:hAnsi="Arial"/>
                 <w:sz w:val="17"/>
               </w:rPr>
-              <w:t>Install barricade and cover</w:t>
+              <w:t>Rec 3</w:t>
             </w:r>
           </w:p>
         </w:tc>
@@ -939,7 +936,7 @@
                 <w:rFonts w:ascii="Arial" w:hAnsi="Arial"/>
                 <w:sz w:val="17"/>
               </w:rPr>
-              <w:t>Bob Wilson</w:t>
+              <w:t>Worker 3</w:t>
             </w:r>
           </w:p>
         </w:tc>
@@ -964,7 +961,7 @@
                 <w:rFonts w:ascii="Arial" w:hAnsi="Arial"/>
                 <w:sz w:val="17"/>
               </w:rPr>
-              <w:t>17/09/2026</w:t>
+              <w:t>03/09/2026</w:t>
             </w:r>
           </w:p>
         </w:tc>
@@ -1067,7 +1064,7 @@
                 <w:b/>
                 <w:sz w:val="18"/>
               </w:rPr>
-              <w:t>Name: Officer Mike</w:t>
+              <w:t>Name: Safety A</w:t>
               <w:br/>
             </w:r>
             <w:r>
@@ -1075,7 +1072,7 @@
                 <w:b/>
                 <w:sz w:val="18"/>
               </w:rPr>
-              <w:t>Date: 15/09/2026</w:t>
+              <w:t>Date: 01/09/2026</w:t>
               <w:br/>
               <w:br/>
             </w:r>
@@ -1119,7 +1116,7 @@
                 <w:b/>
                 <w:sz w:val="18"/>
               </w:rPr>
-              <w:t>Name: John Doe</w:t>
+              <w:t>Name: Worker 1</w:t>
               <w:br/>
             </w:r>
             <w:r>
@@ -1127,7 +1124,7 @@
                 <w:b/>
                 <w:sz w:val="18"/>
               </w:rPr>
-              <w:t>Date: 15/09/2026</w:t>
+              <w:t>Date: 01/09/2026</w:t>
             </w:r>
           </w:p>
         </w:tc>
@@ -1308,7 +1305,7 @@
                 <w:b/>
                 <w:sz w:val="19"/>
               </w:rPr>
-              <w:t>18/09/2026</w:t>
+              <w:t>04/09/2026</w:t>
             </w:r>
           </w:p>
         </w:tc>
@@ -1616,7 +1613,6 @@
                 <w:rFonts w:ascii="Arial" w:hAnsi="Arial"/>
                 <w:sz w:val="17"/>
               </w:rPr>
-              <w:t>4</w:t>
             </w:r>
           </w:p>
         </w:tc>
@@ -1641,7 +1637,7 @@
                 <w:rFonts w:ascii="Arial" w:hAnsi="Arial"/>
                 <w:sz w:val="17"/>
               </w:rPr>
-              <w:t>Gate 2</w:t>
+              <w:t>Area D</w:t>
             </w:r>
           </w:p>
         </w:tc>
@@ -1666,7 +1662,7 @@
                 <w:rFonts w:ascii="Arial" w:hAnsi="Arial"/>
                 <w:sz w:val="17"/>
               </w:rPr>
-              <w:t>No safety helmet</w:t>
+              <w:t>Obs 4</w:t>
             </w:r>
           </w:p>
         </w:tc>
@@ -1691,7 +1687,7 @@
                 <w:rFonts w:ascii="Arial" w:hAnsi="Arial"/>
                 <w:sz w:val="17"/>
               </w:rPr>
-              <w:t>Provide PPE</w:t>
+              <w:t>Rec 4</w:t>
             </w:r>
           </w:p>
         </w:tc>
@@ -1716,7 +1712,7 @@
                 <w:rFonts w:ascii="Arial" w:hAnsi="Arial"/>
                 <w:sz w:val="17"/>
               </w:rPr>
-              <w:t>Alice Brown</w:t>
+              <w:t>Worker 4</w:t>
             </w:r>
           </w:p>
         </w:tc>
@@ -1741,7 +1737,7 @@
                 <w:rFonts w:ascii="Arial" w:hAnsi="Arial"/>
                 <w:sz w:val="17"/>
               </w:rPr>
-              <w:t>18/09/2026</w:t>
+              <w:t>04/09/2026</w:t>
             </w:r>
           </w:p>
         </w:tc>
@@ -1796,6 +1792,211 @@
           </w:p>
         </w:tc>
       </w:tr>
+      <w:tr>
+        <w:trPr>
+          <w:cantSplit/>
+          <w:trHeight w:val="1360" w:hRule="atLeast"/>
+        </w:trPr>
+        <w:tc>
+          <w:tcPr>
+            <w:tcW w:type="dxa" w:w="792"/>
+            <w:tcMar>
+              <w:top w:w="100" w:type="dxa"/>
+              <w:bottom w:w="100" w:type="dxa"/>
+              <w:left w:w="90" w:type="dxa"/>
+              <w:right w:w="90" w:type="dxa"/>
+            </w:tcMar>
+            <w:vAlign w:val="center"/>
+          </w:tcPr>
+          <w:p>
+            <w:pPr>
+              <w:spacing w:before="0" w:after="0"/>
+              <w:jc w:val="center"/>
+            </w:pPr>
+            <w:r>
+              <w:rPr>
+                <w:rFonts w:ascii="Arial" w:hAnsi="Arial"/>
+                <w:sz w:val="17"/>
+              </w:rPr>
+            </w:r>
+          </w:p>
+        </w:tc>
+        <w:tc>
+          <w:tcPr>
+            <w:tcW w:type="dxa" w:w="1728"/>
+            <w:tcMar>
+              <w:top w:w="100" w:type="dxa"/>
+              <w:bottom w:w="100" w:type="dxa"/>
+              <w:left w:w="90" w:type="dxa"/>
+              <w:right w:w="90" w:type="dxa"/>
+            </w:tcMar>
+            <w:vAlign w:val="center"/>
+          </w:tcPr>
+          <w:p>
+            <w:pPr>
+              <w:spacing w:before="0" w:after="0"/>
+              <w:jc w:val="center"/>
+            </w:pPr>
+            <w:r>
+              <w:rPr>
+                <w:rFonts w:ascii="Arial" w:hAnsi="Arial"/>
+                <w:sz w:val="17"/>
+              </w:rPr>
+              <w:t>Area E</w:t>
+            </w:r>
+          </w:p>
+        </w:tc>
+        <w:tc>
+          <w:tcPr>
+            <w:tcW w:type="dxa" w:w="4104"/>
+            <w:tcMar>
+              <w:top w:w="100" w:type="dxa"/>
+              <w:bottom w:w="100" w:type="dxa"/>
+              <w:left w:w="90" w:type="dxa"/>
+              <w:right w:w="90" w:type="dxa"/>
+            </w:tcMar>
+            <w:vAlign w:val="center"/>
+          </w:tcPr>
+          <w:p>
+            <w:pPr>
+              <w:spacing w:before="0" w:after="0"/>
+              <w:jc w:val="left"/>
+            </w:pPr>
+            <w:r>
+              <w:rPr>
+                <w:rFonts w:ascii="Arial" w:hAnsi="Arial"/>
+                <w:sz w:val="17"/>
+              </w:rPr>
+              <w:t>Obs 5</w:t>
+            </w:r>
+          </w:p>
+        </w:tc>
+        <w:tc>
+          <w:tcPr>
+            <w:tcW w:type="dxa" w:w="4104"/>
+            <w:tcMar>
+              <w:top w:w="100" w:type="dxa"/>
+              <w:bottom w:w="100" w:type="dxa"/>
+              <w:left w:w="90" w:type="dxa"/>
+              <w:right w:w="90" w:type="dxa"/>
+            </w:tcMar>
+            <w:vAlign w:val="center"/>
+          </w:tcPr>
+          <w:p>
+            <w:pPr>
+              <w:spacing w:before="0" w:after="0"/>
+              <w:jc w:val="left"/>
+            </w:pPr>
+            <w:r>
+              <w:rPr>
+                <w:rFonts w:ascii="Arial" w:hAnsi="Arial"/>
+                <w:sz w:val="17"/>
+              </w:rPr>
+              <w:t>Rec 5</w:t>
+            </w:r>
+          </w:p>
+        </w:tc>
+        <w:tc>
+          <w:tcPr>
+            <w:tcW w:type="dxa" w:w="1656"/>
+            <w:tcMar>
+              <w:top w:w="100" w:type="dxa"/>
+              <w:bottom w:w="100" w:type="dxa"/>
+              <w:left w:w="90" w:type="dxa"/>
+              <w:right w:w="90" w:type="dxa"/>
+            </w:tcMar>
+            <w:vAlign w:val="center"/>
+          </w:tcPr>
+          <w:p>
+            <w:pPr>
+              <w:spacing w:before="0" w:after="0"/>
+              <w:jc w:val="center"/>
+            </w:pPr>
+            <w:r>
+              <w:rPr>
+                <w:rFonts w:ascii="Arial" w:hAnsi="Arial"/>
+                <w:sz w:val="17"/>
+              </w:rPr>
+              <w:t>Worker 5</w:t>
+            </w:r>
+          </w:p>
+        </w:tc>
+        <w:tc>
+          <w:tcPr>
+            <w:tcW w:type="dxa" w:w="1224"/>
+            <w:tcMar>
+              <w:top w:w="100" w:type="dxa"/>
+              <w:bottom w:w="100" w:type="dxa"/>
+              <w:left w:w="90" w:type="dxa"/>
+              <w:right w:w="90" w:type="dxa"/>
+            </w:tcMar>
+            <w:vAlign w:val="center"/>
+          </w:tcPr>
+          <w:p>
+            <w:pPr>
+              <w:spacing w:before="0" w:after="0"/>
+              <w:jc w:val="center"/>
+            </w:pPr>
+            <w:r>
+              <w:rPr>
+                <w:rFonts w:ascii="Arial" w:hAnsi="Arial"/>
+                <w:sz w:val="17"/>
+              </w:rPr>
+              <w:t>05/09/2026</w:t>
+            </w:r>
+          </w:p>
+        </w:tc>
+        <w:tc>
+          <w:tcPr>
+            <w:tcW w:type="dxa" w:w="936"/>
+            <w:tcMar>
+              <w:top w:w="100" w:type="dxa"/>
+              <w:bottom w:w="100" w:type="dxa"/>
+              <w:left w:w="90" w:type="dxa"/>
+              <w:right w:w="90" w:type="dxa"/>
+            </w:tcMar>
+            <w:vAlign w:val="center"/>
+          </w:tcPr>
+          <w:p>
+            <w:pPr>
+              <w:spacing w:before="0" w:after="0"/>
+              <w:jc w:val="center"/>
+            </w:pPr>
+            <w:r>
+              <w:rPr>
+                <w:rFonts w:ascii="Arial" w:hAnsi="Arial"/>
+                <w:sz w:val="17"/>
+              </w:rPr>
+              <w:t>Major</w:t>
+            </w:r>
+          </w:p>
+        </w:tc>
+        <w:tc>
+          <w:tcPr>
+            <w:tcW w:type="dxa" w:w="936"/>
+            <w:tcMar>
+              <w:top w:w="100" w:type="dxa"/>
+              <w:bottom w:w="100" w:type="dxa"/>
+              <w:left w:w="90" w:type="dxa"/>
+              <w:right w:w="90" w:type="dxa"/>
+            </w:tcMar>
+            <w:vAlign w:val="center"/>
+          </w:tcPr>
+          <w:p>
+            <w:pPr>
+              <w:spacing w:before="0" w:after="0"/>
+              <w:jc w:val="center"/>
+            </w:pPr>
+            <w:r>
+              <w:rPr>
+                <w:rFonts w:ascii="Arial" w:hAnsi="Arial"/>
+                <w:sz w:val="17"/>
+              </w:rPr>
+              <w:t>Open</w:t>
+            </w:r>
+          </w:p>
+        </w:tc>
+      </w:tr>
     </w:tbl>
     <w:p>
       <w:pPr>
@@ -1844,7 +2045,7 @@
                 <w:b/>
                 <w:sz w:val="18"/>
               </w:rPr>
-              <w:t>Name: Officer Sarah</w:t>
+              <w:t>Name: Safety A</w:t>
               <w:br/>
             </w:r>
             <w:r>
@@ -1852,7 +2053,7 @@
                 <w:b/>
                 <w:sz w:val="18"/>
               </w:rPr>
-              <w:t>Date: 18/09/2026</w:t>
+              <w:t>Date: 04/09/2026</w:t>
               <w:br/>
               <w:br/>
             </w:r>
@@ -1896,7 +2097,7 @@
                 <w:b/>
                 <w:sz w:val="18"/>
               </w:rPr>
-              <w:t>Name: Alice Brown</w:t>
+              <w:t>Name: Worker 1</w:t>
               <w:br/>
             </w:r>
             <w:r>
@@ -1904,7 +2105,7 @@
                 <w:b/>
                 <w:sz w:val="18"/>
               </w:rPr>
-              <w:t>Date: 18/09/2026</w:t>
+              <w:t>Date: 04/09/2026</w:t>
             </w:r>
           </w:p>
         </w:tc>

</xml_diff>

<commit_message>
chore: update sample observation data
Refreshed session data and output files with new observation entries for testing purposes.
</commit_message>
<xml_diff>
--- a/output/HSE_Observation_Register.docx
+++ b/output/HSE_Observation_Register.docx
@@ -119,7 +119,7 @@
                 <w:b/>
                 <w:sz w:val="19"/>
               </w:rPr>
-              <w:t>01/09/2026</w:t>
+              <w:t>10/09/2026</w:t>
             </w:r>
           </w:p>
         </w:tc>
@@ -451,7 +451,7 @@
                 <w:rFonts w:ascii="Arial" w:hAnsi="Arial"/>
                 <w:sz w:val="17"/>
               </w:rPr>
-              <w:t>Area A</w:t>
+              <w:t>Area 1</w:t>
             </w:r>
           </w:p>
         </w:tc>
@@ -476,7 +476,7 @@
                 <w:rFonts w:ascii="Arial" w:hAnsi="Arial"/>
                 <w:sz w:val="17"/>
               </w:rPr>
-              <w:t>Obs 1</w:t>
+              <w:t>Finding A</w:t>
             </w:r>
           </w:p>
         </w:tc>
@@ -501,7 +501,7 @@
                 <w:rFonts w:ascii="Arial" w:hAnsi="Arial"/>
                 <w:sz w:val="17"/>
               </w:rPr>
-              <w:t>Rec 1</w:t>
+              <w:t>Action A</w:t>
             </w:r>
           </w:p>
         </w:tc>
@@ -526,7 +526,7 @@
                 <w:rFonts w:ascii="Arial" w:hAnsi="Arial"/>
                 <w:sz w:val="17"/>
               </w:rPr>
-              <w:t>Worker 1</w:t>
+              <w:t>User A</w:t>
             </w:r>
           </w:p>
         </w:tc>
@@ -551,7 +551,7 @@
                 <w:rFonts w:ascii="Arial" w:hAnsi="Arial"/>
                 <w:sz w:val="17"/>
               </w:rPr>
-              <w:t>01/09/2026</w:t>
+              <w:t>10/09/2026</w:t>
             </w:r>
           </w:p>
         </w:tc>
@@ -656,7 +656,7 @@
                 <w:rFonts w:ascii="Arial" w:hAnsi="Arial"/>
                 <w:sz w:val="17"/>
               </w:rPr>
-              <w:t>Area B</w:t>
+              <w:t>Area 2</w:t>
             </w:r>
           </w:p>
         </w:tc>
@@ -681,7 +681,7 @@
                 <w:rFonts w:ascii="Arial" w:hAnsi="Arial"/>
                 <w:sz w:val="17"/>
               </w:rPr>
-              <w:t>Obs 2</w:t>
+              <w:t>Finding B</w:t>
             </w:r>
           </w:p>
         </w:tc>
@@ -706,7 +706,7 @@
                 <w:rFonts w:ascii="Arial" w:hAnsi="Arial"/>
                 <w:sz w:val="17"/>
               </w:rPr>
-              <w:t>Rec 2</w:t>
+              <w:t>Action B</w:t>
             </w:r>
           </w:p>
         </w:tc>
@@ -731,7 +731,7 @@
                 <w:rFonts w:ascii="Arial" w:hAnsi="Arial"/>
                 <w:sz w:val="17"/>
               </w:rPr>
-              <w:t>Worker 2</w:t>
+              <w:t>User B</w:t>
             </w:r>
           </w:p>
         </w:tc>
@@ -756,7 +756,7 @@
                 <w:rFonts w:ascii="Arial" w:hAnsi="Arial"/>
                 <w:sz w:val="17"/>
               </w:rPr>
-              <w:t>02/09/2026</w:t>
+              <w:t>11/09/2026</w:t>
             </w:r>
           </w:p>
         </w:tc>
@@ -861,7 +861,7 @@
                 <w:rFonts w:ascii="Arial" w:hAnsi="Arial"/>
                 <w:sz w:val="17"/>
               </w:rPr>
-              <w:t>Area C</w:t>
+              <w:t>Area 3</w:t>
             </w:r>
           </w:p>
         </w:tc>
@@ -886,7 +886,7 @@
                 <w:rFonts w:ascii="Arial" w:hAnsi="Arial"/>
                 <w:sz w:val="17"/>
               </w:rPr>
-              <w:t>Obs 3</w:t>
+              <w:t>Finding C</w:t>
             </w:r>
           </w:p>
         </w:tc>
@@ -911,7 +911,7 @@
                 <w:rFonts w:ascii="Arial" w:hAnsi="Arial"/>
                 <w:sz w:val="17"/>
               </w:rPr>
-              <w:t>Rec 3</w:t>
+              <w:t>Action C</w:t>
             </w:r>
           </w:p>
         </w:tc>
@@ -936,7 +936,7 @@
                 <w:rFonts w:ascii="Arial" w:hAnsi="Arial"/>
                 <w:sz w:val="17"/>
               </w:rPr>
-              <w:t>Worker 3</w:t>
+              <w:t>User C</w:t>
             </w:r>
           </w:p>
         </w:tc>
@@ -961,7 +961,7 @@
                 <w:rFonts w:ascii="Arial" w:hAnsi="Arial"/>
                 <w:sz w:val="17"/>
               </w:rPr>
-              <w:t>03/09/2026</w:t>
+              <w:t>12/09/2026</w:t>
             </w:r>
           </w:p>
         </w:tc>
@@ -1064,7 +1064,7 @@
                 <w:b/>
                 <w:sz w:val="18"/>
               </w:rPr>
-              <w:t>Name: Safety A</w:t>
+              <w:t>Name: Officer 1</w:t>
               <w:br/>
             </w:r>
             <w:r>
@@ -1072,7 +1072,7 @@
                 <w:b/>
                 <w:sz w:val="18"/>
               </w:rPr>
-              <w:t>Date: 01/09/2026</w:t>
+              <w:t>Date: 10/09/2026</w:t>
               <w:br/>
               <w:br/>
             </w:r>
@@ -1116,7 +1116,7 @@
                 <w:b/>
                 <w:sz w:val="18"/>
               </w:rPr>
-              <w:t>Name: Worker 1</w:t>
+              <w:t>Name: User A</w:t>
               <w:br/>
             </w:r>
             <w:r>
@@ -1124,7 +1124,7 @@
                 <w:b/>
                 <w:sz w:val="18"/>
               </w:rPr>
-              <w:t>Date: 01/09/2026</w:t>
+              <w:t>Date: 10/09/2026</w:t>
             </w:r>
           </w:p>
         </w:tc>
@@ -1305,7 +1305,7 @@
                 <w:b/>
                 <w:sz w:val="19"/>
               </w:rPr>
-              <w:t>04/09/2026</w:t>
+              <w:t>13/09/2026</w:t>
             </w:r>
           </w:p>
         </w:tc>
@@ -1637,7 +1637,7 @@
                 <w:rFonts w:ascii="Arial" w:hAnsi="Arial"/>
                 <w:sz w:val="17"/>
               </w:rPr>
-              <w:t>Area D</w:t>
+              <w:t>Area 4</w:t>
             </w:r>
           </w:p>
         </w:tc>
@@ -1662,7 +1662,7 @@
                 <w:rFonts w:ascii="Arial" w:hAnsi="Arial"/>
                 <w:sz w:val="17"/>
               </w:rPr>
-              <w:t>Obs 4</w:t>
+              <w:t>Finding D</w:t>
             </w:r>
           </w:p>
         </w:tc>
@@ -1687,7 +1687,7 @@
                 <w:rFonts w:ascii="Arial" w:hAnsi="Arial"/>
                 <w:sz w:val="17"/>
               </w:rPr>
-              <w:t>Rec 4</w:t>
+              <w:t>Action D</w:t>
             </w:r>
           </w:p>
         </w:tc>
@@ -1712,7 +1712,7 @@
                 <w:rFonts w:ascii="Arial" w:hAnsi="Arial"/>
                 <w:sz w:val="17"/>
               </w:rPr>
-              <w:t>Worker 4</w:t>
+              <w:t>User D</w:t>
             </w:r>
           </w:p>
         </w:tc>
@@ -1737,7 +1737,7 @@
                 <w:rFonts w:ascii="Arial" w:hAnsi="Arial"/>
                 <w:sz w:val="17"/>
               </w:rPr>
-              <w:t>04/09/2026</w:t>
+              <w:t>13/09/2026</w:t>
             </w:r>
           </w:p>
         </w:tc>
@@ -1792,211 +1792,6 @@
           </w:p>
         </w:tc>
       </w:tr>
-      <w:tr>
-        <w:trPr>
-          <w:cantSplit/>
-          <w:trHeight w:val="1360" w:hRule="atLeast"/>
-        </w:trPr>
-        <w:tc>
-          <w:tcPr>
-            <w:tcW w:type="dxa" w:w="792"/>
-            <w:tcMar>
-              <w:top w:w="100" w:type="dxa"/>
-              <w:bottom w:w="100" w:type="dxa"/>
-              <w:left w:w="90" w:type="dxa"/>
-              <w:right w:w="90" w:type="dxa"/>
-            </w:tcMar>
-            <w:vAlign w:val="center"/>
-          </w:tcPr>
-          <w:p>
-            <w:pPr>
-              <w:spacing w:before="0" w:after="0"/>
-              <w:jc w:val="center"/>
-            </w:pPr>
-            <w:r>
-              <w:rPr>
-                <w:rFonts w:ascii="Arial" w:hAnsi="Arial"/>
-                <w:sz w:val="17"/>
-              </w:rPr>
-            </w:r>
-          </w:p>
-        </w:tc>
-        <w:tc>
-          <w:tcPr>
-            <w:tcW w:type="dxa" w:w="1728"/>
-            <w:tcMar>
-              <w:top w:w="100" w:type="dxa"/>
-              <w:bottom w:w="100" w:type="dxa"/>
-              <w:left w:w="90" w:type="dxa"/>
-              <w:right w:w="90" w:type="dxa"/>
-            </w:tcMar>
-            <w:vAlign w:val="center"/>
-          </w:tcPr>
-          <w:p>
-            <w:pPr>
-              <w:spacing w:before="0" w:after="0"/>
-              <w:jc w:val="center"/>
-            </w:pPr>
-            <w:r>
-              <w:rPr>
-                <w:rFonts w:ascii="Arial" w:hAnsi="Arial"/>
-                <w:sz w:val="17"/>
-              </w:rPr>
-              <w:t>Area E</w:t>
-            </w:r>
-          </w:p>
-        </w:tc>
-        <w:tc>
-          <w:tcPr>
-            <w:tcW w:type="dxa" w:w="4104"/>
-            <w:tcMar>
-              <w:top w:w="100" w:type="dxa"/>
-              <w:bottom w:w="100" w:type="dxa"/>
-              <w:left w:w="90" w:type="dxa"/>
-              <w:right w:w="90" w:type="dxa"/>
-            </w:tcMar>
-            <w:vAlign w:val="center"/>
-          </w:tcPr>
-          <w:p>
-            <w:pPr>
-              <w:spacing w:before="0" w:after="0"/>
-              <w:jc w:val="left"/>
-            </w:pPr>
-            <w:r>
-              <w:rPr>
-                <w:rFonts w:ascii="Arial" w:hAnsi="Arial"/>
-                <w:sz w:val="17"/>
-              </w:rPr>
-              <w:t>Obs 5</w:t>
-            </w:r>
-          </w:p>
-        </w:tc>
-        <w:tc>
-          <w:tcPr>
-            <w:tcW w:type="dxa" w:w="4104"/>
-            <w:tcMar>
-              <w:top w:w="100" w:type="dxa"/>
-              <w:bottom w:w="100" w:type="dxa"/>
-              <w:left w:w="90" w:type="dxa"/>
-              <w:right w:w="90" w:type="dxa"/>
-            </w:tcMar>
-            <w:vAlign w:val="center"/>
-          </w:tcPr>
-          <w:p>
-            <w:pPr>
-              <w:spacing w:before="0" w:after="0"/>
-              <w:jc w:val="left"/>
-            </w:pPr>
-            <w:r>
-              <w:rPr>
-                <w:rFonts w:ascii="Arial" w:hAnsi="Arial"/>
-                <w:sz w:val="17"/>
-              </w:rPr>
-              <w:t>Rec 5</w:t>
-            </w:r>
-          </w:p>
-        </w:tc>
-        <w:tc>
-          <w:tcPr>
-            <w:tcW w:type="dxa" w:w="1656"/>
-            <w:tcMar>
-              <w:top w:w="100" w:type="dxa"/>
-              <w:bottom w:w="100" w:type="dxa"/>
-              <w:left w:w="90" w:type="dxa"/>
-              <w:right w:w="90" w:type="dxa"/>
-            </w:tcMar>
-            <w:vAlign w:val="center"/>
-          </w:tcPr>
-          <w:p>
-            <w:pPr>
-              <w:spacing w:before="0" w:after="0"/>
-              <w:jc w:val="center"/>
-            </w:pPr>
-            <w:r>
-              <w:rPr>
-                <w:rFonts w:ascii="Arial" w:hAnsi="Arial"/>
-                <w:sz w:val="17"/>
-              </w:rPr>
-              <w:t>Worker 5</w:t>
-            </w:r>
-          </w:p>
-        </w:tc>
-        <w:tc>
-          <w:tcPr>
-            <w:tcW w:type="dxa" w:w="1224"/>
-            <w:tcMar>
-              <w:top w:w="100" w:type="dxa"/>
-              <w:bottom w:w="100" w:type="dxa"/>
-              <w:left w:w="90" w:type="dxa"/>
-              <w:right w:w="90" w:type="dxa"/>
-            </w:tcMar>
-            <w:vAlign w:val="center"/>
-          </w:tcPr>
-          <w:p>
-            <w:pPr>
-              <w:spacing w:before="0" w:after="0"/>
-              <w:jc w:val="center"/>
-            </w:pPr>
-            <w:r>
-              <w:rPr>
-                <w:rFonts w:ascii="Arial" w:hAnsi="Arial"/>
-                <w:sz w:val="17"/>
-              </w:rPr>
-              <w:t>05/09/2026</w:t>
-            </w:r>
-          </w:p>
-        </w:tc>
-        <w:tc>
-          <w:tcPr>
-            <w:tcW w:type="dxa" w:w="936"/>
-            <w:tcMar>
-              <w:top w:w="100" w:type="dxa"/>
-              <w:bottom w:w="100" w:type="dxa"/>
-              <w:left w:w="90" w:type="dxa"/>
-              <w:right w:w="90" w:type="dxa"/>
-            </w:tcMar>
-            <w:vAlign w:val="center"/>
-          </w:tcPr>
-          <w:p>
-            <w:pPr>
-              <w:spacing w:before="0" w:after="0"/>
-              <w:jc w:val="center"/>
-            </w:pPr>
-            <w:r>
-              <w:rPr>
-                <w:rFonts w:ascii="Arial" w:hAnsi="Arial"/>
-                <w:sz w:val="17"/>
-              </w:rPr>
-              <w:t>Major</w:t>
-            </w:r>
-          </w:p>
-        </w:tc>
-        <w:tc>
-          <w:tcPr>
-            <w:tcW w:type="dxa" w:w="936"/>
-            <w:tcMar>
-              <w:top w:w="100" w:type="dxa"/>
-              <w:bottom w:w="100" w:type="dxa"/>
-              <w:left w:w="90" w:type="dxa"/>
-              <w:right w:w="90" w:type="dxa"/>
-            </w:tcMar>
-            <w:vAlign w:val="center"/>
-          </w:tcPr>
-          <w:p>
-            <w:pPr>
-              <w:spacing w:before="0" w:after="0"/>
-              <w:jc w:val="center"/>
-            </w:pPr>
-            <w:r>
-              <w:rPr>
-                <w:rFonts w:ascii="Arial" w:hAnsi="Arial"/>
-                <w:sz w:val="17"/>
-              </w:rPr>
-              <w:t>Open</w:t>
-            </w:r>
-          </w:p>
-        </w:tc>
-      </w:tr>
     </w:tbl>
     <w:p>
       <w:pPr>
@@ -2045,7 +1840,7 @@
                 <w:b/>
                 <w:sz w:val="18"/>
               </w:rPr>
-              <w:t>Name: Safety A</w:t>
+              <w:t>Name: Officer 1</w:t>
               <w:br/>
             </w:r>
             <w:r>
@@ -2053,7 +1848,7 @@
                 <w:b/>
                 <w:sz w:val="18"/>
               </w:rPr>
-              <w:t>Date: 04/09/2026</w:t>
+              <w:t>Date: 13/09/2026</w:t>
               <w:br/>
               <w:br/>
             </w:r>
@@ -2097,7 +1892,7 @@
                 <w:b/>
                 <w:sz w:val="18"/>
               </w:rPr>
-              <w:t>Name: Worker 1</w:t>
+              <w:t>Name: User A</w:t>
               <w:br/>
             </w:r>
             <w:r>
@@ -2105,7 +1900,7 @@
                 <w:b/>
                 <w:sz w:val="18"/>
               </w:rPr>
-              <w:t>Date: 04/09/2026</w:t>
+              <w:t>Date: 13/09/2026</w:t>
             </w:r>
           </w:p>
         </w:tc>

</xml_diff>